<commit_message>
Thuyet minh chi tiet (tung hien vat): red-square, tretyakov-gallery, cosmonautics-museum [nhom A]
Co-Authored-By: Claude Opus 4.8 <noreply@anthropic.com>
Claude-Session: https://claude.ai/code/session_01Wnzjy9JrGQv5bRdTi7vaUf
</commit_message>
<xml_diff>
--- a/tai-lieu-noi-bo/moscow/cosmonautics-museum.docx
+++ b/tai-lieu-noi-bo/moscow/cosmonautics-museum.docx
@@ -88,6 +88,22 @@
       </w:pPr>
       <w:r>
         <w:t>Ý tưởng bảo tàng thuộc về Tổng công trình sư Sergei Korolev; nơi đây cũng kể lại chuyến bay của Phạm Tuân — người châu Á đầu tiên vào vũ trụ (1980).</w:t>
+      </w:r>
+    </w:p>
+    <w:p>
+      <w:pPr>
+        <w:pStyle w:val="ListBullet"/>
+      </w:pPr>
+      <w:r>
+        <w:t>Phạm Tuân — người Việt Nam và người châu Á đầu tiên bay vào vũ trụ (Soyuz 37, 23/7/1980): câu chuyện tự hào nên kể tại khu Interkosmos.</w:t>
+      </w:r>
+    </w:p>
+    <w:p>
+      <w:pPr>
+        <w:pStyle w:val="ListBullet"/>
+      </w:pPr>
+      <w:r>
+        <w:t>Belka và Strelka — hai chú chó đầu tiên bay quanh Trái Đất rồi trở về an toàn (19/8/1960); Belka được bảo quản và trưng bày trong tủ kính.</w:t>
       </w:r>
     </w:p>
     <w:p>
@@ -528,6 +544,302 @@
         <w:rPr>
           <w:color w:val="152C4E"/>
         </w:rPr>
+        <w:t>Bình minh kỷ nguyên vũ trụ — Sputnik và chú chó Laika</w:t>
+      </w:r>
+    </w:p>
+    <w:p>
+      <w:pPr>
+        <w:jc w:val="both"/>
+      </w:pPr>
+      <w:r>
+        <w:t>Mở đầu hành trình tham quan, hãy dừng ở mô hình vệ tinh Sputnik-1 (tiếng Nga: Спутник-1, nghĩa là «bạn đồng hành»). Đây là vật thể nhân tạo đầu tiên của loài người bay quanh Trái Đất, phóng ngày 4 tháng 10 năm 1957: một quả cầu nhôm bóng loáng đường kính khoảng 58 cm, nặng chừng 83,6 kg, với bốn chiếc ăng-ten dài vươn ra như râu. Tín hiệu «bíp… bíp…» đơn giản mà nó phát về đã khiến cả thế giới sững sờ và chính thức mở màn cuộc chạy đua vào không gian.</w:t>
+      </w:r>
+    </w:p>
+    <w:p>
+      <w:pPr>
+        <w:jc w:val="both"/>
+      </w:pPr>
+      <w:r>
+        <w:t>Cách kể cho khách: chỉ vào quả cầu nhỏ bé và nhấn mạnh rằng chính vật thể trông khiêm tốn này đã thay đổi lịch sử nhân loại — từ đây con người bước ra khỏi cái nôi Trái Đất. Có thể mời khách tưởng tượng cảm giác của người dân năm 1957 khi lần đầu nghe tiếng bíp từ vũ trụ vọng về qua radio.</w:t>
+      </w:r>
+    </w:p>
+    <w:p>
+      <w:pPr>
+        <w:jc w:val="both"/>
+      </w:pPr>
+      <w:r>
+        <w:t>Ngay sau đó là câu chuyện chú chó Laika (Лайка) trên tàu Sputnik-2, phóng ngày 3 tháng 11 năm 1957 — sinh vật sống đầu tiên bay vào quỹ đạo. Đáng tiếc, công nghệ thời đó chưa có cách đưa tàu trở về, nên Laika đã hi sinh trên quỹ đạo. Câu chuyện của Laika vừa bi tráng vừa gợi suy ngẫm về cái giá của những bước đi đầu tiên, và thường khiến khách lặng người xúc động.</w:t>
+      </w:r>
+    </w:p>
+    <w:p>
+      <w:pPr>
+        <w:pStyle w:val="Heading1"/>
+      </w:pPr>
+      <w:r>
+        <w:rPr>
+          <w:color w:val="152C4E"/>
+        </w:rPr>
+        <w:t>Belka và Strelka — hai chú chó trở về từ quỹ đạo</w:t>
+      </w:r>
+    </w:p>
+    <w:p>
+      <w:pPr>
+        <w:jc w:val="both"/>
+      </w:pPr>
+      <w:r>
+        <w:t>Một trong những hiện vật được khách yêu thích nhất là hai chú chó vũ trụ Belka («Đốm trắng») và Strelka («Mũi tên»). Ngày 19 tháng 8 năm 1960, chúng bay trên tàu Korabl-Sputnik 2 (còn gọi là Sputnik 5), lượn 17 vòng quanh Trái Đất trong khoảng 27 giờ rồi trở về mặt đất an toàn — trở thành những sinh vật bậc cao đầu tiên sống sót sau một chuyến bay quỹ đạo.</w:t>
+      </w:r>
+    </w:p>
+    <w:p>
+      <w:pPr>
+        <w:jc w:val="both"/>
+      </w:pPr>
+      <w:r>
+        <w:t>Ít ai biết trên khoang tàu hôm đó còn có cả một «sở thú tí hon»: 42 con chuột nhắt, 2 con chuột cống, 1 con thỏ, ruồi giấm cùng nhiều cây cỏ và nấm — và tất cả đều sống sót. Chuyến bay này chứng minh rằng cơ thể sống có thể chịu đựng được điều kiện vũ trụ, dọn đường cho chuyến bay của Gagarin chỉ tám tháng sau đó.</w:t>
+      </w:r>
+    </w:p>
+    <w:p>
+      <w:pPr>
+        <w:jc w:val="both"/>
+      </w:pPr>
+      <w:r>
+        <w:t>Trong bảo tàng, chú chó Belka được bảo quản (nhồi bông) và đặt trong tủ kính để khách chiêm ngưỡng tận mắt. Một giai thoại khách rất thích: sau chuyến bay, Strelka sinh ra một lứa cún con, và một chú tên Pushinka đã được lãnh đạo Liên Xô Nikita Khrushchev tặng cho con gái Tổng thống Mỹ John F. Kennedy năm 1961 — một cử chỉ ngoại giao giữa hai siêu cường đang căng thẳng.</w:t>
+      </w:r>
+    </w:p>
+    <w:p>
+      <w:pPr>
+        <w:jc w:val="both"/>
+      </w:pPr>
+      <w:r>
+        <w:t>Gợi ý cách kể: đứng trước tủ kính, hãy hỏi khách «Theo anh chị, ai mới là người… à không, sinh vật bay lên quỹ đạo và trở về trước cả Gagarin?». Câu hỏi nhỏ này luôn tạo bất ngờ thú vị và giúp khách nhớ mãi.</w:t>
+      </w:r>
+    </w:p>
+    <w:p>
+      <w:pPr>
+        <w:pStyle w:val="Heading1"/>
+      </w:pPr>
+      <w:r>
+        <w:rPr>
+          <w:color w:val="152C4E"/>
+        </w:rPr>
+        <w:t>Gagarin và khoang tàu Vostok</w:t>
+      </w:r>
+    </w:p>
+    <w:p>
+      <w:pPr>
+        <w:jc w:val="both"/>
+      </w:pPr>
+      <w:r>
+        <w:t>Trung tâm của bảo tàng là câu chuyện Yuri Gagarin (Юрий Гагарин) — người đầu tiên bay vào vũ trụ. Sáng 12 tháng 4 năm 1961, trên con tàu Vostok-1 (Восток-1, nghĩa là «Phương Đông»), Gagarin bay một vòng quanh Trái Đất trong 108 phút. Trước lúc phóng, anh thốt lên câu nói bất hủ «Poyekhali!» — «Lên đường!». Ngày này về sau trở thành Ngày Du hành Vũ trụ, và cũng chính là ngày bảo tàng mở cửa trở lại sau trùng tu (12/4/2009).</w:t>
+      </w:r>
+    </w:p>
+    <w:p>
+      <w:pPr>
+        <w:jc w:val="both"/>
+      </w:pPr>
+      <w:r>
+        <w:t>Bảo tàng trưng bày khoang hồi quyển kiểu Vostok cùng nhiều kỷ vật gắn với Gagarin: bộ đồ, vật dụng cá nhân và tài liệu. Hãy để khách quan sát khoang tàu tròn nhỏ đến mức nào — phi hành gia phải cuộn mình trong đó suốt chuyến bay.</w:t>
+      </w:r>
+    </w:p>
+    <w:p>
+      <w:pPr>
+        <w:jc w:val="both"/>
+      </w:pPr>
+      <w:r>
+        <w:t>Một chi tiết ít người biết đáng để kể: khoang Vostok không hạ cánh nhẹ nhàng, nên theo quy trình thời đó, Gagarin đã bung dù bật ra khỏi khoang ở độ cao khoảng 7 km và tiếp đất riêng bằng dù. Suốt nhiều năm Liên Xô giữ kín chi tiết này để chuyến bay được công nhận kỷ lục theo luật hàng không quốc tế.</w:t>
+      </w:r>
+    </w:p>
+    <w:p>
+      <w:pPr>
+        <w:pStyle w:val="Heading1"/>
+      </w:pPr>
+      <w:r>
+        <w:rPr>
+          <w:color w:val="152C4E"/>
+        </w:rPr>
+        <w:t>Chinh phục Mặt Trăng — Lunokhod và mẫu vật Mặt Trăng</w:t>
+      </w:r>
+    </w:p>
+    <w:p>
+      <w:pPr>
+        <w:jc w:val="both"/>
+      </w:pPr>
+      <w:r>
+        <w:t>Khu trưng bày về Mặt Trăng có mô hình xe tự hành Lunokhod (Луноход, nghĩa là «kẻ đi trên Mặt Trăng»). Lunokhod-1, đưa lên Mặt Trăng năm 1970, là chiếc xe tự hành đầu tiên hoạt động trên một thiên thể khác: tám bánh, chạy bằng năng lượng Mặt Trời, được các kỹ sư điều khiển từ xa ngay trên Trái Đất. Trông nó giống một chiếc «bồn tắm có bánh xe» với chiếc nắp mở ra để hứng nắng.</w:t>
+      </w:r>
+    </w:p>
+    <w:p>
+      <w:pPr>
+        <w:jc w:val="both"/>
+      </w:pPr>
+      <w:r>
+        <w:t>Bảo tàng cũng giới thiệu thành quả của các tàu thăm dò Luna từng mang mẫu đất đá Mặt Trăng về Trái Đất bằng robot — điều mà Liên Xô làm được không cần phi hành gia. Trong số hiện vật quý còn có lá cờ nhỏ gắn mảnh vật chất từ Mặt Trăng; theo bảo tàng, đây là quà do phía Hoa Kỳ (thời Tổng thống Richard Nixon) trao tặng năm 1970.</w:t>
+      </w:r>
+    </w:p>
+    <w:p>
+      <w:pPr>
+        <w:jc w:val="both"/>
+      </w:pPr>
+      <w:r>
+        <w:t>Cách kể: đây là dịp để nêu một góc nhìn thú vị — trong khi Mỹ chạy đua đưa người lên Mặt Trăng (Apollo), Liên Xô chọn hướng dùng robot và xe tự hành. Mỗi bên có một «chiến thắng» riêng trong cuộc đua không gian.</w:t>
+      </w:r>
+    </w:p>
+    <w:p>
+      <w:pPr>
+        <w:pStyle w:val="Heading1"/>
+      </w:pPr>
+      <w:r>
+        <w:rPr>
+          <w:color w:val="152C4E"/>
+        </w:rPr>
+        <w:t>Trạm quỹ đạo Mir và đời sống phi hành gia</w:t>
+      </w:r>
+    </w:p>
+    <w:p>
+      <w:pPr>
+        <w:jc w:val="both"/>
+      </w:pPr>
+      <w:r>
+        <w:t>Một điểm dừng được khách thích thú là mô hình khối lõi trạm không gian Mir (Мир, nghĩa là «Hòa bình» và cũng là «Thế giới») — nơi khách có thể bước hẳn vào bên trong. Đây là cơ hội hiếm để hình dung phi hành gia thực sự sống ra sao trên quỹ đạo: chỗ ngủ gắn thẳng đứng vào vách, bàn ăn có dây buộc để đồ không trôi, và cả nhà vệ sinh trong môi trường không trọng lực.</w:t>
+      </w:r>
+    </w:p>
+    <w:p>
+      <w:pPr>
+        <w:jc w:val="both"/>
+      </w:pPr>
+      <w:r>
+        <w:t>Gần đó thường trưng bày đồ ăn vũ trụ đóng tuýp và hộp — súp, thịt, thậm chí cả bánh mì cỡ một miếng cắn để không vụn ra. Hãy mời khách đoán xem món nào là món gì; chi tiết «ăn uống trong vũ trụ» luôn khiến cả người lớn lẫn trẻ em thích thú.</w:t>
+      </w:r>
+    </w:p>
+    <w:p>
+      <w:pPr>
+        <w:jc w:val="both"/>
+      </w:pPr>
+      <w:r>
+        <w:t>Gợi ý cách kể: nhấn mạnh rằng mọi thứ trên trạm đều phải tính đến chuyện «không có trên và dưới» — đó là lý do vì sao giường ngủ có thể gắn lên tường, còn phi hành gia phải luồn chân vào dây đai để khỏi trôi đi khi ngủ.</w:t>
+      </w:r>
+    </w:p>
+    <w:p>
+      <w:pPr>
+        <w:pStyle w:val="Heading1"/>
+      </w:pPr>
+      <w:r>
+        <w:rPr>
+          <w:color w:val="152C4E"/>
+        </w:rPr>
+        <w:t>Phạm Tuân — người Việt Nam và người châu Á đầu tiên bay vào vũ trụ</w:t>
+      </w:r>
+    </w:p>
+    <w:p>
+      <w:pPr>
+        <w:jc w:val="both"/>
+      </w:pPr>
+      <w:r>
+        <w:t>Đây là phần khách Việt Nam mong chờ nhất, và người hướng dẫn nên dành thời gian kể thật kỹ tại khu trưng bày về chương trình Interkosmos (Интеркосмос) — chương trình đưa phi hành gia các nước bạn của Liên Xô bay vào vũ trụ. Ngày 23 tháng 7 năm 1980, phi công Phạm Tuân đã bay trên tàu Soyuz 37 (Союз-37) cùng phi hành gia Liên Xô Viktor Gorbatko, lên trạm quỹ đạo Salyut 6 (Салют-6) — trở thành người Việt Nam đầu tiên và cũng là người châu Á đầu tiên bay vào vũ trụ.</w:t>
+      </w:r>
+    </w:p>
+    <w:p>
+      <w:pPr>
+        <w:jc w:val="both"/>
+      </w:pPr>
+      <w:r>
+        <w:t>Chuyến bay kéo dài 7 ngày 20 giờ 42 phút, hoàn thành 142 vòng quanh Trái Đất, và hạ cánh ngày 31 tháng 7 năm 1980 (trở về bằng tàu Soyuz 36). Trên quỹ đạo, Phạm Tuân thực hiện các thí nghiệm khoa học, trong đó có thí nghiệm trồng cây bèo hoa dâu (azolla) trong môi trường vi trọng lực, quan sát nung chảy khoáng chất, và chụp ảnh lãnh thổ Việt Nam từ vũ trụ phục vụ lập bản đồ.</w:t>
+      </w:r>
+    </w:p>
+    <w:p>
+      <w:pPr>
+        <w:jc w:val="both"/>
+      </w:pPr>
+      <w:r>
+        <w:t>Một chi tiết làm khách càng thêm tự hào: trước khi thành phi hành gia, đêm 27 tháng 12 năm 1972, phi công Phạm Tuân lái tiêm kích MiG-21 và (theo tư liệu Việt Nam) đã bắn rơi một «pháo đài bay» B-52 của Mỹ trong chiến dịch Linebacker II trên bầu trời Hà Nội. Ông được phong Anh hùng Lực lượng vũ trang nhân dân Việt Nam, Anh hùng Liên Xô, nhận Huân chương Hồ Chí Minh và Huân chương Lenin, về sau mang quân hàm Trung tướng.</w:t>
+      </w:r>
+    </w:p>
+    <w:p>
+      <w:pPr>
+        <w:jc w:val="both"/>
+      </w:pPr>
+      <w:r>
+        <w:t>Gợi ý cách kể: hãy dừng lại, hỏi cả đoàn «Anh chị có biết ai là người Việt Nam đầu tiên bay vào vũ trụ không?» rồi kể trọn câu chuyện. Nhấn mạnh rằng khi đó Việt Nam vừa ra khỏi chiến tranh chỉ vài năm mà đã có người bay lên quỹ đạo — một niềm tự hào lớn. (Nếu tại thời điểm tham quan không thấy hiện vật riêng về Phạm Tuân, vẫn nên kể câu chuyện này ngay tại khu Interkosmos, nơi tôn vinh các phi hành gia quốc tế.)</w:t>
+      </w:r>
+    </w:p>
+    <w:p>
+      <w:pPr>
+        <w:pStyle w:val="Heading1"/>
+      </w:pPr>
+      <w:r>
+        <w:rPr>
+          <w:color w:val="152C4E"/>
+        </w:rPr>
+        <w:t>Đài tưởng niệm Những người chinh phục Không gian &amp; Hẻm Phi hành gia</w:t>
+      </w:r>
+    </w:p>
+    <w:p>
+      <w:pPr>
+        <w:jc w:val="both"/>
+      </w:pPr>
+      <w:r>
+        <w:t>Bản thân tòa nhà bảo tàng nằm ngay dưới chân Đài tưởng niệm Những người chinh phục Không gian (Монумент «Покорителям космоса») — cây tháp bằng titan cao 107 mét, nghiêng 77 độ, tạo hình như luồng lửa của một con tàu đang lao vút lên trời với chiếc tên lửa nhỏ trên đỉnh. Đài được khánh thành ngày 4 tháng 10 năm 1964, đúng dịp kỷ niệm 7 năm ngày phóng Sputnik-1.</w:t>
+      </w:r>
+    </w:p>
+    <w:p>
+      <w:pPr>
+        <w:jc w:val="both"/>
+      </w:pPr>
+      <w:r>
+        <w:t>Công trình do nhà điêu khắc A. P. Faidysh-Krandievsky cùng các kiến trúc sư M. O. Barshch và A. N. Kolchin thiết kế, được chọn từ khoảng 350 phương án dự thi. Dưới chân đài là tượng nhà bác học Konstantin Tsiolkovsky (Константин Циолковский) — người đặt nền móng lý thuyết cho ngành du hành vũ trụ và được coi là «ông tổ» của tên lửa Nga.</w:t>
+      </w:r>
+    </w:p>
+    <w:p>
+      <w:pPr>
+        <w:jc w:val="both"/>
+      </w:pPr>
+      <w:r>
+        <w:t>Dẫn tới đài là Hẻm Phi hành gia (Аллея Космонавтов), hai bên đặt tượng bán thân các anh hùng vũ trụ như Gagarin, Valentina Tereshkova (người phụ nữ đầu tiên bay vào vũ trụ) và Tổng công trình sư Sergei Korolev, nối liền tới ga metro VDNKh. Đây là chỗ chụp ảnh tuyệt đẹp: mời khách lùi ra xa để lấy trọn cây tháp titan vươn thẳng lên nền trời.</w:t>
+      </w:r>
+    </w:p>
+    <w:p>
+      <w:pPr>
+        <w:pStyle w:val="Heading1"/>
+      </w:pPr>
+      <w:r>
+        <w:rPr>
+          <w:color w:val="152C4E"/>
+        </w:rPr>
+        <w:t>Gợi ý lộ trình tham quan &amp; cách kể cho khách Việt</w:t>
+      </w:r>
+    </w:p>
+    <w:p>
+      <w:pPr>
+        <w:jc w:val="both"/>
+      </w:pPr>
+      <w:r>
+        <w:t>Lộ trình gợi ý khoảng 60–90 phút, kể theo trình tự lịch sử để khách dễ theo dõi: bắt đầu từ Sputnik và Laika (mở màn) → Belka &amp; Strelka (những chú chó trở về) → Gagarin và khoang Vostok (người đầu tiên) → khu Mặt Trăng với Lunokhod → mô hình trạm Mir (đời sống phi hành gia) → và chốt lại ở khu Interkosmos với câu chuyện Phạm Tuân để tạo cao trào tự hào dân tộc.</w:t>
+      </w:r>
+    </w:p>
+    <w:p>
+      <w:pPr>
+        <w:jc w:val="both"/>
+      </w:pPr>
+      <w:r>
+        <w:t>Bảo tàng lưu giữ khoảng 85.000 hiện vật và đón chừng 300.000 lượt khách mỗi năm, nên vào cuối tuần khá đông; nếu đi đoàn, nên mua vé trước và hẹn điểm tập trung rõ ràng. Bảo tàng mở cửa lần đầu ngày 10 tháng 4 năm 1981 theo ý tưởng của chính Tổng công trình sư Korolev, và mở lại sau trùng tu ngày 12 tháng 4 năm 2009.</w:t>
+      </w:r>
+    </w:p>
+    <w:p>
+      <w:pPr>
+        <w:jc w:val="both"/>
+      </w:pPr>
+      <w:r>
+        <w:t>Kết hợp trong ngày: bảo tàng nằm ngay cạnh Trung tâm Triển lãm Thành tựu Quốc dân VDNKh (ВДНХ) — nơi có Pavilion «Vũ trụ», tên lửa Vostok thật dựng ngoài trời và tàu con thoi Buran. Rất hợp lý để tham quan Bảo tàng Du hành Vũ trụ buổi sáng rồi dạo VDNKh buổi chiều, tất cả quanh ga metro VDNKh.</w:t>
+      </w:r>
+    </w:p>
+    <w:p>
+      <w:pPr>
+        <w:pStyle w:val="Heading1"/>
+      </w:pPr>
+      <w:r>
+        <w:rPr>
+          <w:color w:val="152C4E"/>
+        </w:rPr>
         <w:t>Hình ảnh (link chèn cho bản HTML)</w:t>
       </w:r>
     </w:p>
@@ -723,6 +1035,81 @@
       </w:r>
     </w:p>
     <w:p>
+      <w:r>
+        <w:rPr>
+          <w:sz w:val="22"/>
+        </w:rPr>
+        <w:t xml:space="preserve">• Wikipedia (EN) — Memorial Museum of Cosmonautics — </w:t>
+      </w:r>
+      <w:r>
+        <w:rPr>
+          <w:color w:val="204A86"/>
+          <w:sz w:val="20"/>
+        </w:rPr>
+        <w:t>https://en.wikipedia.org/wiki/Memorial_Museum_of_Cosmonautics</w:t>
+      </w:r>
+    </w:p>
+    <w:p>
+      <w:r>
+        <w:rPr>
+          <w:sz w:val="22"/>
+        </w:rPr>
+        <w:t xml:space="preserve">• Wikipedia (EN) — Phạm Tuân — </w:t>
+      </w:r>
+      <w:r>
+        <w:rPr>
+          <w:color w:val="204A86"/>
+          <w:sz w:val="20"/>
+        </w:rPr>
+        <w:t>https://en.wikipedia.org/wiki/Pham_Tuan</w:t>
+      </w:r>
+    </w:p>
+    <w:p>
+      <w:r>
+        <w:rPr>
+          <w:sz w:val="22"/>
+        </w:rPr>
+        <w:t xml:space="preserve">• Wikipedia (EN) — Belka and Strelka — </w:t>
+      </w:r>
+      <w:r>
+        <w:rPr>
+          <w:color w:val="204A86"/>
+          <w:sz w:val="20"/>
+        </w:rPr>
+        <w:t>https://en.wikipedia.org/wiki/Belka_and_Strelka</w:t>
+      </w:r>
+    </w:p>
+    <w:p>
+      <w:r>
+        <w:rPr>
+          <w:sz w:val="22"/>
+        </w:rPr>
+        <w:t xml:space="preserve">• Wikipedia (EN) — Monument to the Conquerors of Space — </w:t>
+      </w:r>
+      <w:r>
+        <w:rPr>
+          <w:color w:val="204A86"/>
+          <w:sz w:val="20"/>
+        </w:rPr>
+        <w:t>https://en.wikipedia.org/wiki/Monument_to_the_Conquerors_of_Space</w:t>
+      </w:r>
+    </w:p>
+    <w:p>
+      <w:r>
+        <w:rPr>
+          <w:sz w:val="22"/>
+        </w:rPr>
+        <w:t xml:space="preserve">• Trang chính thức bảo tàng — kosmo-museum.ru — </w:t>
+      </w:r>
+      <w:r>
+        <w:rPr>
+          <w:color w:val="204A86"/>
+          <w:sz w:val="20"/>
+        </w:rPr>
+        <w:t>https://kosmo-museum.ru</w:t>
+      </w:r>
+    </w:p>
+    <w:p>
       <w:pPr>
         <w:pStyle w:val="Heading2"/>
       </w:pPr>
@@ -790,11 +1177,47 @@
     <w:p>
       <w:r>
         <w:rPr>
+          <w:color w:val="5C6773"/>
+          <w:sz w:val="20"/>
+        </w:rPr>
+        <w:t>Wikipedia (EN) «Pham Tuan» — chuyến bay Soyuz 37 ngày 23/7/1980 cùng Viktor Gorbatko lên Salyut 6, thời lượng 7 ngày 20 giờ 42 phút, 142 vòng quanh Trái Đất, hạ cánh 31/7/1980; thí nghiệm bèo hoa dâu (azolla); bắn rơi B-52 đêm 27/12/1972; các danh hiệu Anh hùng.</w:t>
+      </w:r>
+    </w:p>
+    <w:p>
+      <w:r>
+        <w:rPr>
+          <w:color w:val="5C6773"/>
+          <w:sz w:val="20"/>
+        </w:rPr>
+        <w:t>Wikipedia (EN) «Belka and Strelka» — bay 19/8/1960 trên Korabl-Sputnik 2 (Sputnik 5), 17 vòng/~27 giờ, cùng 42 chuột nhắt, 2 chuột cống, 1 thỏ, ruồi, cây và nấm; cún Pushinka tặng gia đình Kennedy 1961.</w:t>
+      </w:r>
+    </w:p>
+    <w:p>
+      <w:r>
+        <w:rPr>
+          <w:color w:val="5C6773"/>
+          <w:sz w:val="20"/>
+        </w:rPr>
+        <w:t>Wikipedia (EN) «Monument to the Conquerors of Space» — cao 107 m, nghiêng 77°, ốp titan, khánh thành 4/10/1964, tác giả Faidysh-Krandievsky / Barshch / Kolchin, chọn từ ~350 phương án; tượng Tsiolkovsky; Hẻm Phi hành gia.</w:t>
+      </w:r>
+    </w:p>
+    <w:p>
+      <w:r>
+        <w:rPr>
+          <w:color w:val="5C6773"/>
+          <w:sz w:val="20"/>
+        </w:rPr>
+        <w:t>Dữ kiện Sputnik-1 (4/10/1957, ~58 cm, ~83,6 kg), Laika (Sputnik-2, 3/11/1957), Gagarin/Vostok-1 (12/4/1961, 108 phút), Lunokhod-1 (1970): kiến thức lịch sử hàng không vũ trụ phổ quát, cần đối chiếu bảng chú thích tại chỗ.</w:t>
+      </w:r>
+    </w:p>
+    <w:p>
+      <w:r>
+        <w:rPr>
           <w:i/>
           <w:color w:val="5C6773"/>
           <w:sz w:val="18"/>
         </w:rPr>
-        <w:t>Tài liệu nội bộ — không dùng cho mục đích public. Biên soạn nguyên gốc, có dẫn nguồn. Cập nhật 2026-08-11.</w:t>
+        <w:t>Tài liệu nội bộ — không dùng cho mục đích public. Biên soạn nguyên gốc, có dẫn nguồn. Cập nhật 2026-09-28.</w:t>
       </w:r>
     </w:p>
     <w:sectPr>

</xml_diff>

<commit_message>
Thuyết minh chi tiết (từng hiện vật): red-square, tretyakov-gallery, cosmonautics-museum [nhóm A]
Co-Authored-By: Claude Opus 4.8 <noreply@anthropic.com>
Claude-Session: https://claude.ai/code/session_017hVQER4H4NJym5UW3L4Wpv
</commit_message>
<xml_diff>
--- a/tai-lieu-noi-bo/moscow/cosmonautics-museum.docx
+++ b/tai-lieu-noi-bo/moscow/cosmonautics-museum.docx
@@ -108,6 +108,38 @@
     </w:p>
     <w:p>
       <w:pPr>
+        <w:pStyle w:val="ListBullet"/>
+      </w:pPr>
+      <w:r>
+        <w:t>Bộ đồ «Berkut» của Leonov (chuyến đi bộ ngoài không gian đầu tiên, 1965) và «Orlan» vẫn dùng trên ISS ngày nay.</w:t>
+      </w:r>
+    </w:p>
+    <w:p>
+      <w:pPr>
+        <w:pStyle w:val="ListBullet"/>
+      </w:pPr>
+      <w:r>
+        <w:t>Sputnik-1: quả cầu 58 cm, 83,6 kg, phóng 4/10/1957 — hiện vật là bản sao kích thước thật (bản gốc đã cháy khi hồi quyển).</w:t>
+      </w:r>
+    </w:p>
+    <w:p>
+      <w:pPr>
+        <w:pStyle w:val="ListBullet"/>
+      </w:pPr>
+      <w:r>
+        <w:t>Khoang gốc Gagarin thực sự bay nay ở Bảo tàng RKK Energia (Korolyov); tại đây trưng bày khoang thuộc dòng Vostok — lưu ý khi thuyết minh.</w:t>
+      </w:r>
+    </w:p>
+    <w:p>
+      <w:pPr>
+        <w:pStyle w:val="ListBullet"/>
+      </w:pPr>
+      <w:r>
+        <w:t>Đài titan khánh thành 4/10/1964, chọn từ ~350 phương án; tác giả Faidysh-Krandievsky, Barshch, Kolchin.</w:t>
+      </w:r>
+    </w:p>
+    <w:p>
+      <w:pPr>
         <w:pStyle w:val="Heading1"/>
       </w:pPr>
       <w:r>
@@ -573,6 +605,22 @@
     </w:p>
     <w:p>
       <w:pPr>
+        <w:jc w:val="both"/>
+      </w:pPr>
+      <w:r>
+        <w:t>Con số để đời: Sputnik-1 (Спутник-1) rời bệ phóng ngày 4/10/1957, là vệ tinh nhân tạo đầu tiên của loài người — một quả cầu kim loại đánh bóng đường kính 58 cm, nặng 83,6 kg, với bốn ăng-ten dài phát tín hiệu «bíp… bíp…» trên tần số 20,005 và 40,002 MHz mà dân vô tuyến nghiệp dư khắp thế giới đều bắt được.</w:t>
+      </w:r>
+    </w:p>
+    <w:p>
+      <w:pPr>
+        <w:jc w:val="both"/>
+      </w:pPr>
+      <w:r>
+        <w:t>Vệ tinh bay quanh Trái Đất khoảng ba tháng, hoàn tất chừng 1.440 vòng rồi bốc cháy khi trở lại khí quyển đầu tháng 1/1958. Bản gốc đã cháy rụi nên hiện vật trưng bày là bản sao kích thước thật. Mẹo kể: chỉ cho khách thấy nó nhỏ và đơn giản đến bất ngờ, vậy mà đã mở ra cả Kỷ nguyên Vũ trụ và châm ngòi cuộc đua không gian Xô–Mỹ.</w:t>
+      </w:r>
+    </w:p>
+    <w:p>
+      <w:pPr>
         <w:pStyle w:val="Heading1"/>
       </w:pPr>
       <w:r>
@@ -651,6 +699,22 @@
     </w:p>
     <w:p>
       <w:pPr>
+        <w:jc w:val="both"/>
+      </w:pPr>
+      <w:r>
+        <w:t>Khoang đổ bộ Vostok là một quả cầu đường kính 2,30 m. Ngày 12/4/1961, Yuri Gagarin bay đúng một vòng quanh Trái Đất trong 108 phút; khi tàu còn cách mặt đất khoảng 7 km, ông bật ghế phóng thoát ra khỏi khoang và tiếp đất riêng bằng dù gần Engels, vùng Saratov — chi tiết mà Liên Xô giữ kín trong nhiều năm.</w:t>
+      </w:r>
+    </w:p>
+    <w:p>
+      <w:pPr>
+        <w:jc w:val="both"/>
+      </w:pPr>
+      <w:r>
+        <w:t>Lưu ý cho hướng dẫn viên: khoang gốc mà Gagarin thực sự bay hiện được lưu ở Bảo tàng RKK Energia (thành phố Korolyov); hiện vật tại đây là khoang tàu thuộc dòng Vostok — vẫn là báu vật thật của chương trình. Mẹo kể: đứng cạnh quả cầu cháy sém này, hãy nhắc rằng một con người đã cuộn tròn bên trong nó lao qua khí quyển với vận tốc vũ trụ.</w:t>
+      </w:r>
+    </w:p>
+    <w:p>
+      <w:pPr>
         <w:pStyle w:val="Heading1"/>
       </w:pPr>
       <w:r>
@@ -686,6 +750,22 @@
     </w:p>
     <w:p>
       <w:pPr>
+        <w:jc w:val="both"/>
+      </w:pPr>
+      <w:r>
+        <w:t>Lunokhod-1 (Луноход-1) đáp xuống Mặt Trăng ngày 17/11/1970 (theo tàu Luna 17) — chiếc xe tự hành điều khiển từ xa đầu tiên lăn bánh trên một thiên thể khác. Nặng 756 kg, đi trên tám bánh độc lập; nắp lưng mở ra để lộ tấm pin mặt trời sạc điện ban ngày, còn ban đêm dùng nguồn nhiệt đồng vị giữ ấm.</w:t>
+      </w:r>
+    </w:p>
+    <w:p>
+      <w:pPr>
+        <w:jc w:val="both"/>
+      </w:pPr>
+      <w:r>
+        <w:t>Nó hoạt động suốt 11 «ngày Mặt Trăng» (khoảng 322 ngày Trái Đất), đi được 10,54 km và gửi về hơn 20.000 bức ảnh — vượt xa tuổi thọ thiết kế. Hiện vật trưng bày là mô hình kỹ thuật. Gần đó thường có mẫu đất Mặt Trăng và lá cờ Liên Xô kèm mảnh đá Mặt Trăng do Tổng thống Mỹ Nixon tặng tháng 6/1970 — dấu tích thú vị của cả sự cạnh tranh lẫn giao lưu Xô–Mỹ.</w:t>
+      </w:r>
+    </w:p>
+    <w:p>
+      <w:pPr>
         <w:pStyle w:val="Heading1"/>
       </w:pPr>
       <w:r>
@@ -795,6 +875,146 @@
       </w:pPr>
       <w:r>
         <w:t>Dẫn tới đài là Hẻm Phi hành gia (Аллея Космонавтов), hai bên đặt tượng bán thân các anh hùng vũ trụ như Gagarin, Valentina Tereshkova (người phụ nữ đầu tiên bay vào vũ trụ) và Tổng công trình sư Sergei Korolev, nối liền tới ga metro VDNKh. Đây là chỗ chụp ảnh tuyệt đẹp: mời khách lùi ra xa để lấy trọn cây tháp titan vươn thẳng lên nền trời.</w:t>
+      </w:r>
+    </w:p>
+    <w:p>
+      <w:pPr>
+        <w:jc w:val="both"/>
+      </w:pPr>
+      <w:r>
+        <w:t>Đài tưởng niệm khánh thành ngày 4/10/1964 (đúng bảy năm sau Sputnik), được chọn từ khoảng 350 phương án dự thi sau cú sốc Sputnik. Tác giả là nhà điêu khắc Andrei Faidysh-Krandievsky cùng các kiến trúc sư Mikhail Barshch và Alexander Kolchin; dưới chân đài là tượng nhà lý thuyết du hành vũ trụ Konstantin Tsiolkovsky.</w:t>
+      </w:r>
+    </w:p>
+    <w:p>
+      <w:pPr>
+        <w:jc w:val="both"/>
+      </w:pPr>
+      <w:r>
+        <w:t>Bảo tàng nằm trong phần bệ của đài, mở cửa năm 1981 và tái mở cửa ngày 12/4/2009 (Ngày Du hành Vũ trụ) sau khi mở rộng gấp khoảng ba lần. Mẹo kể: bắt đầu tour từ bên ngoài để khách choáng ngợp với cột titan cao 107 m nghiêng 77°, chụp ảnh, rồi mới đi dọc Hẻm Phi hành gia vào bảo tàng.</w:t>
+      </w:r>
+    </w:p>
+    <w:p>
+      <w:pPr>
+        <w:pStyle w:val="Heading1"/>
+      </w:pPr>
+      <w:r>
+        <w:rPr>
+          <w:color w:val="152C4E"/>
+        </w:rPr>
+        <w:t>Bộ đồ du hành vũ trụ — từ «Berkut» tới «Orlan»</w:t>
+      </w:r>
+    </w:p>
+    <w:p>
+      <w:pPr>
+        <w:jc w:val="both"/>
+      </w:pPr>
+      <w:r>
+        <w:t>Một trong những khu hút khách nhất là bộ sưu tập đồ du hành. «Berkut» (Беркут) là bộ đồ Alexei Leonov mặc khi thực hiện chuyến đi bộ ngoài không gian đầu tiên của loài người năm 1965. «Krechet» (Кречет) là bộ đồ thiết kế cho sứ mệnh đổ bộ Mặt Trăng của Liên Xô (chương trình sau bị huỷ) và là một trong những hiện vật được nhắc tới trong trưng bày của bảo tàng.</w:t>
+      </w:r>
+    </w:p>
+    <w:p>
+      <w:pPr>
+        <w:jc w:val="both"/>
+      </w:pPr>
+      <w:r>
+        <w:t>«Sokol» (Сокол) là bộ đồ mặc khi phóng và hạ cánh trên tàu Soyuz, còn «Orlan» (Орлан) là bộ đồ đi bộ ngoài không gian vẫn đang được dùng trên Trạm Vũ trụ Quốc tế (ISS) đến ngày nay.</w:t>
+      </w:r>
+    </w:p>
+    <w:p>
+      <w:pPr>
+        <w:jc w:val="both"/>
+      </w:pPr>
+      <w:r>
+        <w:t>Mẹo kể: xếp các bộ đồ theo dòng thời gian để khách thấy chúng ngày càng cồng kềnh và tinh vi ra sao; đố khách đoán bộ nào nặng nhất và vì sao lại phải dày đến thế (áp suất, nhiệt độ, vi thiên thạch).</w:t>
+      </w:r>
+    </w:p>
+    <w:p>
+      <w:pPr>
+        <w:pStyle w:val="Heading1"/>
+      </w:pPr>
+      <w:r>
+        <w:rPr>
+          <w:color w:val="152C4E"/>
+        </w:rPr>
+        <w:t>Động cơ tên lửa &amp; «trái tim» của những con tàu</w:t>
+      </w:r>
+    </w:p>
+    <w:p>
+      <w:pPr>
+        <w:jc w:val="both"/>
+      </w:pPr>
+      <w:r>
+        <w:t>Sức mạnh đưa con người lên trời nằm ở động cơ. Bảo tàng trưng bày các khối động cơ tên lửa như RD-214 (từng dùng cho tầng đẩy các tên lửa đời đầu) cùng những mẫu thuộc dòng RD-107/RD-108 gắn với tên lửa R-7 — «con ngựa thồ» đã phóng cả Sputnik lẫn Gagarin và đến nay vẫn là gốc của họ tên lửa Soyuz.</w:t>
+      </w:r>
+    </w:p>
+    <w:p>
+      <w:pPr>
+        <w:jc w:val="both"/>
+      </w:pPr>
+      <w:r>
+        <w:t>Với khách không rành kỹ thuật, mẹo kể là nói về nguyên lý giản dị: đốt nhiên liệu và phụt khí thật nhanh xuống dưới để đẩy tên lửa lên trên; rồi chỉ vào kích thước đồ sộ của loa phụt để khách hình dung lực đẩy khổng lồ cần có để thắng trọng lực Trái Đất.</w:t>
+      </w:r>
+    </w:p>
+    <w:p>
+      <w:pPr>
+        <w:pStyle w:val="Heading1"/>
+      </w:pPr>
+      <w:r>
+        <w:rPr>
+          <w:color w:val="152C4E"/>
+        </w:rPr>
+        <w:t>Những người kiến tạo Kỷ nguyên Vũ trụ — Tsiolkovsky &amp; Korolev</w:t>
+      </w:r>
+    </w:p>
+    <w:p>
+      <w:pPr>
+        <w:jc w:val="both"/>
+      </w:pPr>
+      <w:r>
+        <w:t>Đằng sau mọi con tàu là những bộ óc. Konstantin Tsiolkovsky (Константин Циолковский) — thầy giáo làng bị lãng tai — là nhà lý thuyết đặt nền móng cho du hành vũ trụ từ đầu thế kỷ 20, với câu nói bất hủ đại ý: «Trái Đất là cái nôi của loài người, nhưng ta không thể sống mãi trong nôi».</w:t>
+      </w:r>
+    </w:p>
+    <w:p>
+      <w:pPr>
+        <w:jc w:val="both"/>
+      </w:pPr>
+      <w:r>
+        <w:t>Sergei Korolev (Сергей Королёв) là Tổng công trình sư bí ẩn đứng sau Sputnik, chuyến bay của Gagarin và cả ý tưởng lập nên bảo tàng này. Suốt thời Xô-viết, tên tuổi ông được giữ tuyệt mật vì lý do an ninh — thế giới chỉ biết đến «Tổng công trình sư» mà không rõ danh tính.</w:t>
+      </w:r>
+    </w:p>
+    <w:p>
+      <w:pPr>
+        <w:jc w:val="both"/>
+      </w:pPr>
+      <w:r>
+        <w:t>Mẹo kể: câu chuyện Korolev từng bị tù oan trong trại lao động rồi trở thành người đưa Liên Xô dẫn đầu cuộc đua không gian luôn khiến khách xúc động — một lát cắt rất người giữa bảo tàng đầy máy móc.</w:t>
+      </w:r>
+    </w:p>
+    <w:p>
+      <w:pPr>
+        <w:pStyle w:val="Heading1"/>
+      </w:pPr>
+      <w:r>
+        <w:rPr>
+          <w:color w:val="152C4E"/>
+        </w:rPr>
+        <w:t>Hợp tác quốc tế &amp; không gian hôm nay — Interkosmos, Soyuz, ISS</w:t>
+      </w:r>
+    </w:p>
+    <w:p>
+      <w:pPr>
+        <w:jc w:val="both"/>
+      </w:pPr>
+      <w:r>
+        <w:t>Không gian không chỉ là câu chuyện của riêng Liên Xô. Chương trình Interkosmos (Интеркосмос) đã đưa các phi hành gia từ nhiều nước bạn — trong đó có Việt Nam — bay cùng tàu Xô-viết. Khu trưng bày này nối mạch tự nhiên sang câu chuyện đầy tự hào về Phạm Tuân (xem phần riêng).</w:t>
+      </w:r>
+    </w:p>
+    <w:p>
+      <w:pPr>
+        <w:jc w:val="both"/>
+      </w:pPr>
+      <w:r>
+        <w:t>Phần cuối bảo tàng đưa khách đến hiện tại và tương lai: tàu Soyuz vẫn đang chở người lên Trạm Vũ trụ Quốc tế (ISS), nơi Nga là một trong những đối tác chính. Mẹo kể: khép lại tour bằng một câu hỏi mở — «Người tiếp theo đặt chân lên Mặt Trăng hay Sao Hoả sẽ nói thứ tiếng gì?» — để khách ra về với cảm hứng, đúng tinh thần nơi này.</w:t>
       </w:r>
     </w:p>
     <w:p>
@@ -1110,6 +1330,51 @@
       </w:r>
     </w:p>
     <w:p>
+      <w:r>
+        <w:rPr>
+          <w:sz w:val="22"/>
+        </w:rPr>
+        <w:t xml:space="preserve">• Sputnik 1 — Wikipedia (EN) — </w:t>
+      </w:r>
+      <w:r>
+        <w:rPr>
+          <w:color w:val="204A86"/>
+          <w:sz w:val="20"/>
+        </w:rPr>
+        <w:t>https://en.wikipedia.org/wiki/Sputnik_1</w:t>
+      </w:r>
+    </w:p>
+    <w:p>
+      <w:r>
+        <w:rPr>
+          <w:sz w:val="22"/>
+        </w:rPr>
+        <w:t xml:space="preserve">• Vostok 1 — Wikipedia (EN) — </w:t>
+      </w:r>
+      <w:r>
+        <w:rPr>
+          <w:color w:val="204A86"/>
+          <w:sz w:val="20"/>
+        </w:rPr>
+        <w:t>https://en.wikipedia.org/wiki/Vostok_1</w:t>
+      </w:r>
+    </w:p>
+    <w:p>
+      <w:r>
+        <w:rPr>
+          <w:sz w:val="22"/>
+        </w:rPr>
+        <w:t xml:space="preserve">• Lunokhod 1 — Wikipedia (EN) — </w:t>
+      </w:r>
+      <w:r>
+        <w:rPr>
+          <w:color w:val="204A86"/>
+          <w:sz w:val="20"/>
+        </w:rPr>
+        <w:t>https://en.wikipedia.org/wiki/Lunokhod_1</w:t>
+      </w:r>
+    </w:p>
+    <w:p>
       <w:pPr>
         <w:pStyle w:val="Heading2"/>
       </w:pPr>
@@ -1208,6 +1473,51 @@
           <w:sz w:val="20"/>
         </w:rPr>
         <w:t>Dữ kiện Sputnik-1 (4/10/1957, ~58 cm, ~83,6 kg), Laika (Sputnik-2, 3/11/1957), Gagarin/Vostok-1 (12/4/1961, 108 phút), Lunokhod-1 (1970): kiến thức lịch sử hàng không vũ trụ phổ quát, cần đối chiếu bảng chú thích tại chỗ.</w:t>
+      </w:r>
+    </w:p>
+    <w:p>
+      <w:r>
+        <w:rPr>
+          <w:color w:val="5C6773"/>
+          <w:sz w:val="20"/>
+        </w:rPr>
+        <w:t>Wikipedia (EN) — «Sputnik 1»: phóng 4/10/1957, quả cầu 58 cm/83,6 kg, tần số 20,005 &amp; 40,002 MHz, ~1.440 vòng, hồi quyển 1/1958.</w:t>
+      </w:r>
+    </w:p>
+    <w:p>
+      <w:r>
+        <w:rPr>
+          <w:color w:val="5C6773"/>
+          <w:sz w:val="20"/>
+        </w:rPr>
+        <w:t>Wikipedia (EN) — «Vostok 1»: 12/4/1961, khoang cầu Vostok-3KA đường kính 2,30 m, một vòng 108 phút, Gagarin bật ghế phóng ở ~7 km và tiếp đất bằng dù gần Engels; khoang gốc ở Bảo tàng RKK Energia.</w:t>
+      </w:r>
+    </w:p>
+    <w:p>
+      <w:r>
+        <w:rPr>
+          <w:color w:val="5C6773"/>
+          <w:sz w:val="20"/>
+        </w:rPr>
+        <w:t>Wikipedia (EN) — «Lunokhod 1»: đáp 17/11/1970 (Luna 17), 756 kg, 8 bánh, ~10,54 km, hoạt động 11 ngày Mặt Trăng, &gt;20.000 ảnh.</w:t>
+      </w:r>
+    </w:p>
+    <w:p>
+      <w:r>
+        <w:rPr>
+          <w:color w:val="5C6773"/>
+          <w:sz w:val="20"/>
+        </w:rPr>
+        <w:t>Wikipedia (EN) — «Monument to the Conquerors of Space»: cao 107 m, titan, nghiêng 77°, khánh thành 4/10/1964, chọn từ ~350 phương án; tác giả Faidysh-Krandievsky, Barshch, Kolchin; bảo tàng trong bệ mở 1981, tái mở 12/4/2009.</w:t>
+      </w:r>
+    </w:p>
+    <w:p>
+      <w:r>
+        <w:rPr>
+          <w:color w:val="5C6773"/>
+          <w:sz w:val="20"/>
+        </w:rPr>
+        <w:t>Wikipedia (EN) — «Memorial Museum of Cosmonautics»: ~85.000 hiện vật, ~300.000 khách/năm; các hiện vật gồm bộ đồ Krechet, động cơ RD-214, khoang Vostok, xe Lunokhod, mảnh đá Mặt Trăng do Nixon tặng (6/1970).</w:t>
       </w:r>
     </w:p>
     <w:p>

</xml_diff>